<commit_message>
DS: declaracion de uso de IA en reporte y README
</commit_message>
<xml_diff>
--- a/reports/Fase 1_Equipo19.docx
+++ b/reports/Fase 1_Equipo19.docx
@@ -5983,7 +5983,7 @@
           <w:sz w:val="24"/>
           <w:lang w:val="es-MX"/>
         </w:rPr>
-        <w:t>Referencias Bibliográficas</w:t>
+        <w:t>Declaración de uso de herramientas de inteligencia artificial</w:t>
       </w:r>
     </w:p>
     <w:p>
@@ -6001,49 +6001,74 @@
           <w:sz w:val="24"/>
           <w:lang w:val="es-MX"/>
         </w:rPr>
-        <w:t>• MiBici (2024). Datos Abiertos del Sistema de Bicicletas Públicas del Área Metropolitana de Guadalajara. Instituto de Información Estadística y Geográfica de Jalisco (IIEG). https://www.mibici.net/es/datos-abiertos/</w:t>
+        <w:t>En apego a los lineamientos de la actividad, se declara el uso de herramientas de inteligencia artificial en esta fase del proyecto.</w:t>
       </w:r>
     </w:p>
     <w:p>
       <w:pPr>
         <w:spacing w:after="120"/>
         <w:jc w:val="both"/>
+        <w:rPr>
+          <w:lang w:val="es-MX"/>
+        </w:rPr>
       </w:pPr>
       <w:r>
         <w:rPr>
           <w:rFonts w:ascii="Times New Roman" w:hAnsi="Times New Roman"/>
           <w:color w:val="000000"/>
           <w:sz w:val="24"/>
-        </w:rPr>
-        <w:t>• Dorard, L. (2020). Machine Learning Canvas: A framework to define and communicate ML systems. https://www.ownml.co/machine-learning-canvas</w:t>
+          <w:lang w:val="es-MX"/>
+        </w:rPr>
+        <w:t>• Anthropic. (2026). Claude (Opus 5.5) [Modelo de lenguaje grande], utilizado como herramienta de consulta y de apoyo en la revisión de la redacción, la organización, el formato de este reporte y la rúbrica. El experimento corresponde a la ejecución real del pipeline sobre los datos abiertos de MiBici, registrada en MLflow. https://claude.ai/</w:t>
       </w:r>
     </w:p>
     <w:p>
       <w:pPr>
         <w:spacing w:after="120"/>
         <w:jc w:val="both"/>
-      </w:pPr>
-      <w:r>
         <w:rPr>
           <w:rFonts w:ascii="Times New Roman" w:hAnsi="Times New Roman"/>
           <w:color w:val="000000"/>
           <w:sz w:val="24"/>
-        </w:rPr>
-        <w:t>• DrivenData (2023). Cookiecutter Data Science: A logical, reasonably standardized, but flexible project structure for doing and sharing data science work. https://drivendata.github.io/cookiecutter-data-science/</w:t>
-      </w:r>
+          <w:lang w:val="es-MX"/>
+        </w:rPr>
+      </w:pPr>
     </w:p>
     <w:p>
       <w:pPr>
         <w:spacing w:after="120"/>
         <w:jc w:val="both"/>
+        <w:rPr>
+          <w:lang w:val="es-MX"/>
+        </w:rPr>
+      </w:pPr>
+      <w:r>
+        <w:rPr>
+          <w:rFonts w:ascii="Times New Roman" w:hAnsi="Times New Roman"/>
+          <w:b/>
+          <w:color w:val="000000"/>
+          <w:sz w:val="24"/>
+          <w:lang w:val="es-MX"/>
+        </w:rPr>
+        <w:t>Referencias Bibliográficas</w:t>
+      </w:r>
+    </w:p>
+    <w:p>
+      <w:pPr>
+        <w:spacing w:after="120"/>
+        <w:jc w:val="both"/>
+        <w:rPr>
+          <w:lang w:val="es-MX"/>
+        </w:rPr>
       </w:pPr>
       <w:r>
         <w:rPr>
           <w:rFonts w:ascii="Times New Roman" w:hAnsi="Times New Roman"/>
           <w:color w:val="000000"/>
           <w:sz w:val="24"/>
-        </w:rPr>
-        <w:t>• Zaharia, M., Chen, A., Davidson, A., Ghodsi, A., Hong, S. A., Konwinski, A., Murching, S., Nykodym, T., Ogilvie, P., Parkhe, M., Xie, F., &amp; Zumar, C. (2018). Accelerating the Machine Learning Lifecycle with MLflow. IEEE Micro, 38(5), 39-45.</w:t>
+          <w:lang w:val="es-MX"/>
+        </w:rPr>
+        <w:t>• MiBici (2024). Datos Abiertos del Sistema de Bicicletas Públicas del Área Metropolitana de Guadalajara. Instituto de Información Estadística y Geográfica de Jalisco (IIEG). https://www.mibici.net/es/datos-abiertos/</w:t>
       </w:r>
     </w:p>
     <w:p>
@@ -6057,7 +6082,67 @@
           <w:color w:val="000000"/>
           <w:sz w:val="24"/>
         </w:rPr>
+        <w:t>• Dorard, L. (2020). Machine Learning Canvas: A framework to define and communicate ML systems. https://www.ownml.co/machine-learning-canvas</w:t>
+      </w:r>
+    </w:p>
+    <w:p>
+      <w:pPr>
+        <w:spacing w:after="120"/>
+        <w:jc w:val="both"/>
+      </w:pPr>
+      <w:r>
+        <w:rPr>
+          <w:rFonts w:ascii="Times New Roman" w:hAnsi="Times New Roman"/>
+          <w:color w:val="000000"/>
+          <w:sz w:val="24"/>
+        </w:rPr>
+        <w:t>• DrivenData (2023). Cookiecutter Data Science: A logical, reasonably standardized, but flexible project structure for doing and sharing data science work. https://drivendata.github.io/cookiecutter-data-science/</w:t>
+      </w:r>
+    </w:p>
+    <w:p>
+      <w:pPr>
+        <w:spacing w:after="120"/>
+        <w:jc w:val="both"/>
+      </w:pPr>
+      <w:r>
+        <w:rPr>
+          <w:rFonts w:ascii="Times New Roman" w:hAnsi="Times New Roman"/>
+          <w:color w:val="000000"/>
+          <w:sz w:val="24"/>
+        </w:rPr>
+        <w:t>• Zaharia, M., Chen, A., Davidson, A., Ghodsi, A., Hong, S. A., Konwinski, A., Murching, S., Nykodym, T., Ogilvie, P., Parkhe, M., Xie, F., &amp; Zumar, C. (2018). Accelerating the Machine Learning Lifecycle with MLflow. IEEE Micro, 38(5), 39-45.</w:t>
+      </w:r>
+    </w:p>
+    <w:p>
+      <w:pPr>
+        <w:spacing w:after="120"/>
+        <w:jc w:val="both"/>
+      </w:pPr>
+      <w:r>
+        <w:rPr>
+          <w:rFonts w:ascii="Times New Roman" w:hAnsi="Times New Roman"/>
+          <w:color w:val="000000"/>
+          <w:sz w:val="24"/>
+        </w:rPr>
         <w:t>• Sculley, D., Holt, G., Golovin, D., Davydov, E., Phillips, T., Ebner, D., Chaudhary, V., Young, M., Crespo, J. F., &amp; Dennison, D. (2015). Hidden Technical Debt in Machine Learning Systems. Advances in Neural Information Processing Systems (NeurIPS 2015), 28, 2503-2511.</w:t>
+      </w:r>
+    </w:p>
+    <w:p>
+      <w:pPr>
+        <w:spacing w:after="120"/>
+        <w:jc w:val="both"/>
+        <w:rPr>
+          <w:lang w:val="es-MX"/>
+        </w:rPr>
+      </w:pPr>
+      <w:r>
+        <w:rPr>
+          <w:rFonts w:ascii="Times New Roman" w:hAnsi="Times New Roman"/>
+          <w:color w:val="000000"/>
+          <w:sz w:val="24"/>
+          <w:lang w:val="es-MX"/>
+        </w:rPr>
+        <w:t>• Anthropic. (2026). Claude (Opus 5.5) [Modelo de lenguaje grande]. https://claude.ai/</w:t>
       </w:r>
     </w:p>
     <w:p>

</xml_diff>